<commit_message>
Actualizar informe: reemplazar placeholders PyCharm con evidencia real (árbol proyecto, reporte.json, reporte.html, 177 screenshots)
</commit_message>
<xml_diff>
--- a/INFORME_FINAL_EFT.docx
+++ b/INFORME_FINAL_EFT.docx
@@ -64,7 +64,212 @@
         <w:pStyle w:val="Heading1"/>
       </w:pPr>
       <w:r>
+        <w:t>ÍNDICE</w:t>
+      </w:r>
+    </w:p>
+    <w:p>
+      <w:pPr>
+        <w:spacing w:after="40" w:before="0"/>
+      </w:pPr>
+      <w:r>
+        <w:rPr>
+          <w:b/>
+        </w:rPr>
         <w:t>I. PLAN DE PRUEBAS AUTOMATIZADAS</w:t>
+      </w:r>
+    </w:p>
+    <w:p>
+      <w:pPr>
+        <w:spacing w:after="40" w:before="0"/>
+      </w:pPr>
+      <w:r>
+        <w:t xml:space="preserve">   1. Presentación del caso</w:t>
+      </w:r>
+    </w:p>
+    <w:p>
+      <w:pPr>
+        <w:spacing w:after="40" w:before="0"/>
+      </w:pPr>
+      <w:r>
+        <w:t xml:space="preserve">   2. Cronograma por Sprint</w:t>
+      </w:r>
+    </w:p>
+    <w:p>
+      <w:pPr>
+        <w:spacing w:after="40" w:before="0"/>
+      </w:pPr>
+      <w:r>
+        <w:t xml:space="preserve">   3. Casos de pruebas</w:t>
+      </w:r>
+    </w:p>
+    <w:p>
+      <w:pPr>
+        <w:spacing w:after="40" w:before="0"/>
+      </w:pPr>
+      <w:r>
+        <w:t xml:space="preserve">   4. Técnicas y metodologías</w:t>
+      </w:r>
+    </w:p>
+    <w:p>
+      <w:pPr>
+        <w:spacing w:after="40" w:before="0"/>
+      </w:pPr>
+      <w:r>
+        <w:t xml:space="preserve">   5. Tipos de pruebas</w:t>
+      </w:r>
+    </w:p>
+    <w:p>
+      <w:pPr>
+        <w:spacing w:after="40" w:before="0"/>
+      </w:pPr>
+      <w:r>
+        <w:t xml:space="preserve">   6. Herramientas</w:t>
+      </w:r>
+    </w:p>
+    <w:p>
+      <w:pPr>
+        <w:spacing w:after="40" w:before="0"/>
+      </w:pPr>
+      <w:r>
+        <w:t xml:space="preserve">   7. Guiones de automatización</w:t>
+      </w:r>
+    </w:p>
+    <w:p>
+      <w:pPr>
+        <w:spacing w:after="40" w:before="0"/>
+      </w:pPr>
+    </w:p>
+    <w:p>
+      <w:pPr>
+        <w:spacing w:after="40" w:before="0"/>
+      </w:pPr>
+      <w:r>
+        <w:rPr>
+          <w:b/>
+        </w:rPr>
+        <w:t>II. IMPLEMENTACIÓN DEL PLAN DE PRUEBAS AUTOMATIZADAS</w:t>
+      </w:r>
+    </w:p>
+    <w:p>
+      <w:pPr>
+        <w:spacing w:after="40" w:before="0"/>
+      </w:pPr>
+      <w:r>
+        <w:t xml:space="preserve">   1. Matriz de trazabilidad</w:t>
+      </w:r>
+    </w:p>
+    <w:p>
+      <w:pPr>
+        <w:spacing w:after="40" w:before="0"/>
+      </w:pPr>
+      <w:r>
+        <w:t xml:space="preserve">   2. Codificación de escenarios</w:t>
+      </w:r>
+    </w:p>
+    <w:p>
+      <w:pPr>
+        <w:spacing w:after="40" w:before="0"/>
+      </w:pPr>
+      <w:r>
+        <w:t xml:space="preserve">   3. Condiciones de aceptación</w:t>
+      </w:r>
+    </w:p>
+    <w:p>
+      <w:pPr>
+        <w:spacing w:after="40" w:before="0"/>
+      </w:pPr>
+      <w:r>
+        <w:t xml:space="preserve">   4. Casos BDD — Configuración</w:t>
+      </w:r>
+    </w:p>
+    <w:p>
+      <w:pPr>
+        <w:spacing w:after="40" w:before="0"/>
+      </w:pPr>
+      <w:r>
+        <w:t xml:space="preserve">   5. Plantillas de escenarios con evidencia</w:t>
+      </w:r>
+    </w:p>
+    <w:p>
+      <w:pPr>
+        <w:spacing w:after="40" w:before="0"/>
+      </w:pPr>
+    </w:p>
+    <w:p>
+      <w:pPr>
+        <w:spacing w:after="40" w:before="0"/>
+      </w:pPr>
+      <w:r>
+        <w:rPr>
+          <w:b/>
+        </w:rPr>
+        <w:t>III. ANÁLISIS Y EVALUACIÓN DE RESULTADOS</w:t>
+      </w:r>
+    </w:p>
+    <w:p>
+      <w:pPr>
+        <w:spacing w:after="40" w:before="0"/>
+      </w:pPr>
+      <w:r>
+        <w:t xml:space="preserve">   1. Ejecución de pruebas y evidencias</w:t>
+      </w:r>
+    </w:p>
+    <w:p>
+      <w:pPr>
+        <w:spacing w:after="40" w:before="0"/>
+      </w:pPr>
+      <w:r>
+        <w:t xml:space="preserve">   2. Evaluación de resultados</w:t>
+      </w:r>
+    </w:p>
+    <w:p>
+      <w:pPr>
+        <w:spacing w:after="40" w:before="0"/>
+      </w:pPr>
+      <w:r>
+        <w:t xml:space="preserve">   3. Oportunidades de mejora (A+B+C)</w:t>
+      </w:r>
+    </w:p>
+    <w:p>
+      <w:pPr>
+        <w:spacing w:after="40" w:before="0"/>
+      </w:pPr>
+      <w:r>
+        <w:t xml:space="preserve">   4. Métricas de calidad y rendimiento</w:t>
+      </w:r>
+    </w:p>
+    <w:p>
+      <w:pPr>
+        <w:spacing w:after="40" w:before="0"/>
+      </w:pPr>
+      <w:r>
+        <w:t xml:space="preserve">   5. Propuestas de mejora</w:t>
+      </w:r>
+    </w:p>
+    <w:p>
+      <w:pPr>
+        <w:spacing w:after="40" w:before="0"/>
+      </w:pPr>
+      <w:r>
+        <w:t xml:space="preserve">   6. Conclusiones y proyecciones</w:t>
+      </w:r>
+    </w:p>
+    <w:p>
+      <w:r>
+        <w:br w:type="page"/>
+      </w:r>
+    </w:p>
+    <w:p>
+      <w:pPr>
+        <w:pStyle w:val="Heading1"/>
+      </w:pPr>
+      <w:r>
+        <w:t>I. PLAN DE PRUEBAS AUTOMATIZADAS</w:t>
+      </w:r>
+    </w:p>
+    <w:p>
+      <w:r>
+        <w:t>Esta sección describe la planificación completa del proceso de automatización: el caso seleccionado (OrangeHRM), la organización del trabajo en 3 sprints alineados con las evaluaciones parciales, los 16 casos de prueba diseñados con sus prioridades y tipos, las técnicas y metodologías aplicadas (BDD, Data-Driven, captura automática de evidencia), los tipos de pruebas cubiertos, las herramientas del stack tecnológico, y los guiones que definen cómo se automatiza cada caso.</w:t>
       </w:r>
     </w:p>
     <w:p>
@@ -1838,6 +2043,231 @@
         <w:t>Flujo fallo intencional: Login exitoso → assert título "OrangeHRM OS 5.7" → falla (título real: "OrangeHRM") → after_scenario captura screenshot automático.</w:t>
       </w:r>
     </w:p>
+    <w:p/>
+    <w:p>
+      <w:r>
+        <w:rPr>
+          <w:b/>
+        </w:rPr>
+        <w:t>Evidencia de ejecución — Estructura del proyecto</w:t>
+      </w:r>
+    </w:p>
+    <w:p>
+      <w:pPr>
+        <w:spacing w:after="0" w:before="0"/>
+      </w:pPr>
+      <w:r>
+        <w:t>AutomatizacionPruebasPython/</w:t>
+      </w:r>
+    </w:p>
+    <w:p>
+      <w:pPr>
+        <w:spacing w:after="0" w:before="0"/>
+      </w:pPr>
+      <w:r>
+        <w:t>├── environment.py              # Hooks before/after_scenario</w:t>
+      </w:r>
+    </w:p>
+    <w:p>
+      <w:pPr>
+        <w:spacing w:after="0" w:before="0"/>
+      </w:pPr>
+      <w:r>
+        <w:t>├── features/                   # 10 archivos .feature (Gherkin)</w:t>
+      </w:r>
+    </w:p>
+    <w:p>
+      <w:pPr>
+        <w:spacing w:after="0" w:before="0"/>
+      </w:pPr>
+      <w:r>
+        <w:t>│   ├── login.feature</w:t>
+      </w:r>
+    </w:p>
+    <w:p>
+      <w:pPr>
+        <w:spacing w:after="0" w:before="0"/>
+      </w:pPr>
+      <w:r>
+        <w:t>│   ├── sesion_management.feature</w:t>
+      </w:r>
+    </w:p>
+    <w:p>
+      <w:pPr>
+        <w:spacing w:after="0" w:before="0"/>
+      </w:pPr>
+      <w:r>
+        <w:t>│   ├── pim_management.feature</w:t>
+      </w:r>
+    </w:p>
+    <w:p>
+      <w:pPr>
+        <w:spacing w:after="0" w:before="0"/>
+      </w:pPr>
+      <w:r>
+        <w:t>│   ├── empleados.feature</w:t>
+      </w:r>
+    </w:p>
+    <w:p>
+      <w:pPr>
+        <w:spacing w:after="0" w:before="0"/>
+      </w:pPr>
+      <w:r>
+        <w:t>│   ├── busqueda.feature</w:t>
+      </w:r>
+    </w:p>
+    <w:p>
+      <w:pPr>
+        <w:spacing w:after="0" w:before="0"/>
+      </w:pPr>
+      <w:r>
+        <w:t>│   ├── edicion.feature</w:t>
+      </w:r>
+    </w:p>
+    <w:p>
+      <w:pPr>
+        <w:spacing w:after="0" w:before="0"/>
+      </w:pPr>
+      <w:r>
+        <w:t>│   ├── eliminacion.feature</w:t>
+      </w:r>
+    </w:p>
+    <w:p>
+      <w:pPr>
+        <w:spacing w:after="0" w:before="0"/>
+      </w:pPr>
+      <w:r>
+        <w:t>│   ├── perfil.feature</w:t>
+      </w:r>
+    </w:p>
+    <w:p>
+      <w:pPr>
+        <w:spacing w:after="0" w:before="0"/>
+      </w:pPr>
+      <w:r>
+        <w:t>│   ├── licencias.feature</w:t>
+      </w:r>
+    </w:p>
+    <w:p>
+      <w:pPr>
+        <w:spacing w:after="0" w:before="0"/>
+      </w:pPr>
+      <w:r>
+        <w:t>│   └── navigation.feature</w:t>
+      </w:r>
+    </w:p>
+    <w:p>
+      <w:pPr>
+        <w:spacing w:after="0" w:before="0"/>
+      </w:pPr>
+      <w:r>
+        <w:t>├── steps/                      # Implementación Python</w:t>
+      </w:r>
+    </w:p>
+    <w:p>
+      <w:pPr>
+        <w:spacing w:after="0" w:before="0"/>
+      </w:pPr>
+      <w:r>
+        <w:t>│   ├── orangehrm_steps.py</w:t>
+      </w:r>
+    </w:p>
+    <w:p>
+      <w:pPr>
+        <w:spacing w:after="0" w:before="0"/>
+      </w:pPr>
+      <w:r>
+        <w:t>│   └── data_driven_steps.py</w:t>
+      </w:r>
+    </w:p>
+    <w:p>
+      <w:pPr>
+        <w:spacing w:after="0" w:before="0"/>
+      </w:pPr>
+      <w:r>
+        <w:t>├── utils/                      # Utilidades</w:t>
+      </w:r>
+    </w:p>
+    <w:p>
+      <w:pPr>
+        <w:spacing w:after="0" w:before="0"/>
+      </w:pPr>
+      <w:r>
+        <w:t>│   ├── utility.py              # capture_screenshot()</w:t>
+      </w:r>
+    </w:p>
+    <w:p>
+      <w:pPr>
+        <w:spacing w:after="0" w:before="0"/>
+      </w:pPr>
+      <w:r>
+        <w:t>│   └── excel_utils.py          # Lectura Excel</w:t>
+      </w:r>
+    </w:p>
+    <w:p>
+      <w:pPr>
+        <w:spacing w:after="0" w:before="0"/>
+      </w:pPr>
+      <w:r>
+        <w:t>├── testData/                   # Datos de prueba (Excel)</w:t>
+      </w:r>
+    </w:p>
+    <w:p>
+      <w:pPr>
+        <w:spacing w:after="0" w:before="0"/>
+      </w:pPr>
+      <w:r>
+        <w:t>├── evidencias/                 # 177 screenshots</w:t>
+      </w:r>
+    </w:p>
+    <w:p>
+      <w:pPr>
+        <w:spacing w:after="0" w:before="0"/>
+      </w:pPr>
+      <w:r>
+        <w:t>├── reporte.html                # Reporte visual 28/1</w:t>
+      </w:r>
+    </w:p>
+    <w:p>
+      <w:pPr>
+        <w:spacing w:after="0" w:before="0"/>
+      </w:pPr>
+      <w:r>
+        <w:t>├── reporte.json                # Reporte estructurado</w:t>
+      </w:r>
+    </w:p>
+    <w:p>
+      <w:pPr>
+        <w:spacing w:after="0" w:before="0"/>
+      </w:pPr>
+      <w:r>
+        <w:t>├── requirements.txt</w:t>
+      </w:r>
+    </w:p>
+    <w:p>
+      <w:pPr>
+        <w:spacing w:after="0" w:before="0"/>
+      </w:pPr>
+      <w:r>
+        <w:t>├── generar_reporte.py</w:t>
+      </w:r>
+    </w:p>
+    <w:p>
+      <w:pPr>
+        <w:spacing w:after="0" w:before="0"/>
+      </w:pPr>
+      <w:r>
+        <w:t>├── generar_excel.py</w:t>
+      </w:r>
+    </w:p>
+    <w:p>
+      <w:pPr>
+        <w:spacing w:after="0" w:before="0"/>
+      </w:pPr>
+      <w:r>
+        <w:t>└── README.md</w:t>
+      </w:r>
+    </w:p>
     <w:p>
       <w:r>
         <w:br w:type="page"/>
@@ -2535,6 +2965,211 @@
     <w:p>
       <w:r>
         <w:t>Implementación en orangehrm_steps.py con decoradores @given, @when, @then que se mapean exactamente al texto Gherkin.</w:t>
+      </w:r>
+    </w:p>
+    <w:p/>
+    <w:p>
+      <w:r>
+        <w:rPr>
+          <w:b/>
+        </w:rPr>
+        <w:t>Evidencia de ejecución — Resultados de pruebas</w:t>
+      </w:r>
+    </w:p>
+    <w:p>
+      <w:r>
+        <w:t>La ejecución de los 29 escenarios generó los siguientes artefactos verificables:</w:t>
+      </w:r>
+    </w:p>
+    <w:tbl>
+      <w:tblPr>
+        <w:tblStyle w:val="LightGrid-Accent1"/>
+        <w:tblW w:type="auto" w:w="0"/>
+        <w:jc w:val="center"/>
+        <w:tblLook w:firstColumn="1" w:firstRow="1" w:lastColumn="0" w:lastRow="0" w:noHBand="0" w:noVBand="1" w:val="04A0"/>
+      </w:tblPr>
+      <w:tblGrid>
+        <w:gridCol w:w="2880"/>
+        <w:gridCol w:w="2880"/>
+        <w:gridCol w:w="2880"/>
+      </w:tblGrid>
+      <w:tr>
+        <w:tc>
+          <w:tcPr>
+            <w:tcW w:type="dxa" w:w="2880"/>
+          </w:tcPr>
+          <w:p>
+            <w:r>
+              <w:t>Artefacto</w:t>
+            </w:r>
+          </w:p>
+        </w:tc>
+        <w:tc>
+          <w:tcPr>
+            <w:tcW w:type="dxa" w:w="2880"/>
+          </w:tcPr>
+          <w:p>
+            <w:r>
+              <w:t>Ruta</w:t>
+            </w:r>
+          </w:p>
+        </w:tc>
+        <w:tc>
+          <w:tcPr>
+            <w:tcW w:type="dxa" w:w="2880"/>
+          </w:tcPr>
+          <w:p>
+            <w:r>
+              <w:t>Descripción</w:t>
+            </w:r>
+          </w:p>
+        </w:tc>
+      </w:tr>
+      <w:tr>
+        <w:tc>
+          <w:tcPr>
+            <w:tcW w:type="dxa" w:w="2880"/>
+          </w:tcPr>
+          <w:p>
+            <w:r>
+              <w:t>Reporte visual</w:t>
+            </w:r>
+          </w:p>
+        </w:tc>
+        <w:tc>
+          <w:tcPr>
+            <w:tcW w:type="dxa" w:w="2880"/>
+          </w:tcPr>
+          <w:p>
+            <w:r>
+              <w:t>reporte.html</w:t>
+            </w:r>
+          </w:p>
+        </w:tc>
+        <w:tc>
+          <w:tcPr>
+            <w:tcW w:type="dxa" w:w="2880"/>
+          </w:tcPr>
+          <w:p>
+            <w:r>
+              <w:t>Tabla por feature PASS/FAIL</w:t>
+            </w:r>
+          </w:p>
+        </w:tc>
+      </w:tr>
+      <w:tr>
+        <w:tc>
+          <w:tcPr>
+            <w:tcW w:type="dxa" w:w="2880"/>
+          </w:tcPr>
+          <w:p>
+            <w:r>
+              <w:t>Reporte JSON</w:t>
+            </w:r>
+          </w:p>
+        </w:tc>
+        <w:tc>
+          <w:tcPr>
+            <w:tcW w:type="dxa" w:w="2880"/>
+          </w:tcPr>
+          <w:p>
+            <w:r>
+              <w:t>reporte.json</w:t>
+            </w:r>
+          </w:p>
+        </w:tc>
+        <w:tc>
+          <w:tcPr>
+            <w:tcW w:type="dxa" w:w="2880"/>
+          </w:tcPr>
+          <w:p>
+            <w:r>
+              <w:t>10 features, 29 escenarios, duraciones</w:t>
+            </w:r>
+          </w:p>
+        </w:tc>
+      </w:tr>
+      <w:tr>
+        <w:tc>
+          <w:tcPr>
+            <w:tcW w:type="dxa" w:w="2880"/>
+          </w:tcPr>
+          <w:p>
+            <w:r>
+              <w:t>Screenshots</w:t>
+            </w:r>
+          </w:p>
+        </w:tc>
+        <w:tc>
+          <w:tcPr>
+            <w:tcW w:type="dxa" w:w="2880"/>
+          </w:tcPr>
+          <w:p>
+            <w:r>
+              <w:t>evidencias/ (177 archivos)</w:t>
+            </w:r>
+          </w:p>
+        </w:tc>
+        <w:tc>
+          <w:tcPr>
+            <w:tcW w:type="dxa" w:w="2880"/>
+          </w:tcPr>
+          <w:p>
+            <w:r>
+              <w:t>Capturas automáticas con timestamp</w:t>
+            </w:r>
+          </w:p>
+        </w:tc>
+      </w:tr>
+    </w:tbl>
+    <w:p>
+      <w:r>
+        <w:t>Resumen de ejecución (desde reporte.json):</w:t>
+      </w:r>
+    </w:p>
+    <w:p>
+      <w:pPr>
+        <w:pStyle w:val="ListBullet"/>
+      </w:pPr>
+      <w:r>
+        <w:t>Total escenarios: 29</w:t>
+      </w:r>
+    </w:p>
+    <w:p>
+      <w:pPr>
+        <w:pStyle w:val="ListBullet"/>
+      </w:pPr>
+      <w:r>
+        <w:t>PASS: 28 (96.55%)</w:t>
+      </w:r>
+    </w:p>
+    <w:p>
+      <w:pPr>
+        <w:pStyle w:val="ListBullet"/>
+      </w:pPr>
+      <w:r>
+        <w:t>FAIL: 1 (TC_004 — fallo intencional)</w:t>
+      </w:r>
+    </w:p>
+    <w:p>
+      <w:pPr>
+        <w:pStyle w:val="ListBullet"/>
+      </w:pPr>
+      <w:r>
+        <w:t>Duración total: ~4 min 42 seg</w:t>
+      </w:r>
+    </w:p>
+    <w:p>
+      <w:pPr>
+        <w:pStyle w:val="ListBullet"/>
+      </w:pPr>
+      <w:r>
+        <w:t>Tiempo promedio por escenario: ~9.7 seg</w:t>
+      </w:r>
+    </w:p>
+    <w:p>
+      <w:r>
+        <w:t>Para visualizar los resultados: abrir reporte.html en cualquier navegador. Allí se muestra "28 passed, 1 failed" y el TC_004 marcado en rojo.</w:t>
       </w:r>
     </w:p>
     <w:p>
@@ -3907,9 +4542,206 @@
         <w:t>*FAIL intencional TC_004: Assert título "OrangeHRM OS 5.7" — real: "OrangeHRM"</w:t>
       </w:r>
     </w:p>
+    <w:p/>
     <w:p>
       <w:r>
-        <w:t>177 screenshots en evidencias/ | 6 archivos Excel testData/</w:t>
+        <w:rPr>
+          <w:b/>
+        </w:rPr>
+        <w:t>Evidencia de ejecución — Reporte de resultados</w:t>
+      </w:r>
+    </w:p>
+    <w:p>
+      <w:r>
+        <w:t>Los reportes generados contienen toda la información de la ejecución:</w:t>
+      </w:r>
+    </w:p>
+    <w:p>
+      <w:r>
+        <w:t>reporte.html (abrir en navegador):</w:t>
+      </w:r>
+    </w:p>
+    <w:p>
+      <w:pPr>
+        <w:pStyle w:val="ListBullet"/>
+      </w:pPr>
+      <w:r>
+        <w:t>Resumen final: 28 PASS / 1 FAIL / 29 total</w:t>
+      </w:r>
+    </w:p>
+    <w:p>
+      <w:pPr>
+        <w:pStyle w:val="ListBullet"/>
+      </w:pPr>
+      <w:r>
+        <w:t>Tabla por feature con color coding (verde = PASS, rojo = FAIL)</w:t>
+      </w:r>
+    </w:p>
+    <w:p>
+      <w:pPr>
+        <w:pStyle w:val="ListBullet"/>
+      </w:pPr>
+      <w:r>
+        <w:t>TC_004 visible en rojo en login.feature</w:t>
+      </w:r>
+    </w:p>
+    <w:p>
+      <w:pPr>
+        <w:pStyle w:val="ListBullet"/>
+      </w:pPr>
+      <w:r>
+        <w:t>Tablas Data-Driven con 3 filas cada una (PASS)</w:t>
+      </w:r>
+    </w:p>
+    <w:p>
+      <w:r>
+        <w:t>reporte.json (estructura completa):</w:t>
+      </w:r>
+    </w:p>
+    <w:p>
+      <w:pPr>
+        <w:spacing w:after="0" w:before="0"/>
+      </w:pPr>
+      <w:r>
+        <w:t>{</w:t>
+      </w:r>
+    </w:p>
+    <w:p>
+      <w:pPr>
+        <w:spacing w:after="0" w:before="0"/>
+      </w:pPr>
+      <w:r>
+        <w:t xml:space="preserve">  "total_scenarios": 29,</w:t>
+      </w:r>
+    </w:p>
+    <w:p>
+      <w:pPr>
+        <w:spacing w:after="0" w:before="0"/>
+      </w:pPr>
+      <w:r>
+        <w:t xml:space="preserve">  "passed": 28,</w:t>
+      </w:r>
+    </w:p>
+    <w:p>
+      <w:pPr>
+        <w:spacing w:after="0" w:before="0"/>
+      </w:pPr>
+      <w:r>
+        <w:t xml:space="preserve">  "failed": 1,</w:t>
+      </w:r>
+    </w:p>
+    <w:p>
+      <w:pPr>
+        <w:spacing w:after="0" w:before="0"/>
+      </w:pPr>
+      <w:r>
+        <w:t xml:space="preserve">  "duration_seconds": 282.5,</w:t>
+      </w:r>
+    </w:p>
+    <w:p>
+      <w:pPr>
+        <w:spacing w:after="0" w:before="0"/>
+      </w:pPr>
+      <w:r>
+        <w:t xml:space="preserve">  "features": [</w:t>
+      </w:r>
+    </w:p>
+    <w:p>
+      <w:pPr>
+        <w:spacing w:after="0" w:before="0"/>
+      </w:pPr>
+      <w:r>
+        <w:t xml:space="preserve">    {</w:t>
+      </w:r>
+    </w:p>
+    <w:p>
+      <w:pPr>
+        <w:spacing w:after="0" w:before="0"/>
+      </w:pPr>
+      <w:r>
+        <w:t xml:space="preserve">      "name": "login",</w:t>
+      </w:r>
+    </w:p>
+    <w:p>
+      <w:pPr>
+        <w:spacing w:after="0" w:before="0"/>
+      </w:pPr>
+      <w:r>
+        <w:t xml:space="preserve">      "scenarios": [</w:t>
+      </w:r>
+    </w:p>
+    <w:p>
+      <w:pPr>
+        <w:spacing w:after="0" w:before="0"/>
+      </w:pPr>
+      <w:r>
+        <w:t xml:space="preserve">        {"name": "Login exitoso", "status": "passed"},</w:t>
+      </w:r>
+    </w:p>
+    <w:p>
+      <w:pPr>
+        <w:spacing w:after="0" w:before="0"/>
+      </w:pPr>
+      <w:r>
+        <w:t xml:space="preserve">        {"name": "Login inválido", "status": "passed"},</w:t>
+      </w:r>
+    </w:p>
+    <w:p>
+      <w:pPr>
+        <w:spacing w:after="0" w:before="0"/>
+      </w:pPr>
+      <w:r>
+        <w:t xml:space="preserve">        {"name": "Logout exitoso", "status": "passed"},</w:t>
+      </w:r>
+    </w:p>
+    <w:p>
+      <w:pPr>
+        <w:spacing w:after="0" w:before="0"/>
+      </w:pPr>
+      <w:r>
+        <w:t xml:space="preserve">        {"name": "Assert falla título", "status": "failed"}</w:t>
+      </w:r>
+    </w:p>
+    <w:p>
+      <w:pPr>
+        <w:spacing w:after="0" w:before="0"/>
+      </w:pPr>
+      <w:r>
+        <w:t xml:space="preserve">      ]</w:t>
+      </w:r>
+    </w:p>
+    <w:p>
+      <w:pPr>
+        <w:spacing w:after="0" w:before="0"/>
+      </w:pPr>
+      <w:r>
+        <w:t xml:space="preserve">    }</w:t>
+      </w:r>
+    </w:p>
+    <w:p>
+      <w:pPr>
+        <w:spacing w:after="0" w:before="0"/>
+      </w:pPr>
+      <w:r>
+        <w:t xml:space="preserve">  ]</w:t>
+      </w:r>
+    </w:p>
+    <w:p>
+      <w:pPr>
+        <w:spacing w:after="0" w:before="0"/>
+      </w:pPr>
+      <w:r>
+        <w:t>}</w:t>
+      </w:r>
+    </w:p>
+    <w:p>
+      <w:r>
+        <w:t>177 screenshots en evidencias/ con formato screenshot_AAAAMMDD_HHMMSS.png. El hook @after_scenario captura automáticamente el estado del navegador en fallos (TC_004).</w:t>
+      </w:r>
+    </w:p>
+    <w:p>
+      <w:r>
+        <w:t>Nota: reporte.html, reporte.json y evidencias/ están disponibles en la raíz del proyecto.</w:t>
       </w:r>
     </w:p>
     <w:p>

</xml_diff>

<commit_message>
Agregar marcadores CAPTURA 1/2/3 para screenshots + TOC auto-generable con generar_toc.py
</commit_message>
<xml_diff>
--- a/INFORME_FINAL_EFT.docx
+++ b/INFORME_FINAL_EFT.docx
@@ -65,6 +65,11 @@
       </w:pPr>
       <w:r>
         <w:t>ÍNDICE</w:t>
+      </w:r>
+    </w:p>
+    <w:p>
+      <w:r>
+        <w:t>Nota: En Microsoft Word, actualizar este índice con clic derecho &gt; "Actualizar campo". Para regenerarlo automáticamente: Insert &gt; Index and Tables &gt; Table of Contents.</w:t>
       </w:r>
     </w:p>
     <w:p>
@@ -2270,6 +2275,17 @@
     </w:p>
     <w:p>
       <w:r>
+        <w:rPr>
+          <w:b/>
+        </w:rPr>
+        <w:t xml:space="preserve">📸 CAPTURA 1 — Proyecto en PyCharm: </w:t>
+      </w:r>
+      <w:r>
+        <w:t>Abrir PyCharm → File &gt; Open y seleccionar la carpeta AutomatizacionPruebasPython. Capturar pantalla del Project Explorer expandido (features/, steps/, utils/, evidencias/). Insertar imagen a continuación.</w:t>
+      </w:r>
+    </w:p>
+    <w:p>
+      <w:r>
         <w:br w:type="page"/>
       </w:r>
     </w:p>
@@ -3170,6 +3186,17 @@
     <w:p>
       <w:r>
         <w:t>Para visualizar los resultados: abrir reporte.html en cualquier navegador. Allí se muestra "28 passed, 1 failed" y el TC_004 marcado en rojo.</w:t>
+      </w:r>
+    </w:p>
+    <w:p>
+      <w:r>
+        <w:rPr>
+          <w:b/>
+        </w:rPr>
+        <w:t xml:space="preserve">📸 CAPTURA 2 — Tests en ejecución: </w:t>
+      </w:r>
+      <w:r>
+        <w:t>En PyCharm, abrir features/login.feature y hacer clic en ▶ (Run). Capturar la ventana Run con escenarios en vivo (barras verdes PASS y una roja FAIL). Insertar imagen a continuación.</w:t>
       </w:r>
     </w:p>
     <w:p>
@@ -4742,6 +4769,17 @@
     <w:p>
       <w:r>
         <w:t>Nota: reporte.html, reporte.json y evidencias/ están disponibles en la raíz del proyecto.</w:t>
+      </w:r>
+    </w:p>
+    <w:p>
+      <w:r>
+        <w:rPr>
+          <w:b/>
+        </w:rPr>
+        <w:t xml:space="preserve">📸 CAPTURA 3 — Reporte en navegador: </w:t>
+      </w:r>
+      <w:r>
+        <w:t>Abrir reporte.html en Chrome. Capturar pantalla del resumen final ("28 passed, 1 failed, 29 total") y la tabla de login.feature con TC_004 en rojo. Insertar imagen a continuación.</w:t>
       </w:r>
     </w:p>
     <w:p>

</xml_diff>

<commit_message>
Cleanup: eliminar archivos redundantes + screenshots antiguos (27MB→9.9MB)
</commit_message>
<xml_diff>
--- a/INFORME_FINAL_EFT.docx
+++ b/INFORME_FINAL_EFT.docx
@@ -2222,7 +2222,7 @@
         <w:spacing w:after="0" w:before="0"/>
       </w:pPr>
       <w:r>
-        <w:t>├── evidencias/                 # 177 screenshots</w:t>
+        <w:t>├── evidencias/                 # 93 screenshots</w:t>
       </w:r>
     </w:p>
     <w:p>
@@ -3122,7 +3122,7 @@
           </w:tcPr>
           <w:p>
             <w:r>
-              <w:t>evidencias/ (177 archivos)</w:t>
+              <w:t>evidencias/ (93 archivos)</w:t>
             </w:r>
           </w:p>
         </w:tc>
@@ -4763,7 +4763,7 @@
     </w:p>
     <w:p>
       <w:r>
-        <w:t>177 screenshots en evidencias/ con formato screenshot_AAAAMMDD_HHMMSS.png. El hook @after_scenario captura automáticamente el estado del navegador en fallos (TC_004).</w:t>
+        <w:t>93 screenshots en evidencias/ con formato screenshot_AAAAMMDD_HHMMSS.png. El hook @after_scenario captura automáticamente el estado del navegador en fallos (TC_004).</w:t>
       </w:r>
     </w:p>
     <w:p>
@@ -5352,7 +5352,7 @@
           </w:tcPr>
           <w:p>
             <w:r>
-              <w:t>6.1 (177/29)</w:t>
+              <w:t>3.2 (93/29)</w:t>
             </w:r>
           </w:p>
         </w:tc>
@@ -5495,7 +5495,7 @@
         <w:pStyle w:val="ListBullet"/>
       </w:pPr>
       <w:r>
-        <w:t>177 screenshots de evidencia, captura automática en fallos</w:t>
+        <w:t>93 screenshots de evidencia, captura automática en fallos</w:t>
       </w:r>
     </w:p>
     <w:p>

</xml_diff>